<commit_message>
test(corpus): small caps in a font with smcp, and labels checked case by case
Answers the review of #139: Carlito has no smcp feature (only c2sc), so the
small caps documents add Noto Sans, which has one; their descriptions say which
font has it and that mode 12 writes no compatibilityMode setting. The label test
now checks every case's font, size, word, line break and the set of cases.

Co-Authored-By: Claude Opus 5.5 <noreply@anthropic.com>
</commit_message>
<xml_diff>
--- a/tests/corpus/word-rules/E-smallcaps-12.docx
+++ b/tests/corpus/word-rules/E-smallcaps-12.docx
@@ -905,6 +905,461 @@
       <w:r>
         <w:rPr>
           <w:rFonts w:ascii="Carlito" w:hAnsi="Carlito" w:eastAsia="Carlito" w:cs="Carlito"/>
+          <w:smallCaps/>
+          <w:sz w:val="144"/>
+          <w:szCs w:val="144"/>
+        </w:rPr>
+        <w:t xml:space="preserve">Hamburg</w:t>
+      </w:r>
+    </w:p>
+    <w:p>
+      <w:r>
+        <w:rPr>
+          <w:rFonts w:ascii="Noto Sans" w:hAnsi="Noto Sans" w:eastAsia="Noto Sans" w:cs="Noto Sans"/>
+          <w:sz w:val="20"/>
+          <w:szCs w:val="20"/>
+        </w:rPr>
+        <w:t xml:space="preserve">Noto Sans 9 pt, small caps:</w:t>
+      </w:r>
+      <w:r>
+        <w:br/>
+      </w:r>
+      <w:r>
+        <w:rPr>
+          <w:rFonts w:ascii="Noto Sans" w:hAnsi="Noto Sans" w:eastAsia="Noto Sans" w:cs="Noto Sans"/>
+          <w:smallCaps/>
+          <w:sz w:val="18"/>
+          <w:szCs w:val="18"/>
+        </w:rPr>
+        <w:t xml:space="preserve">hamburg</w:t>
+      </w:r>
+    </w:p>
+    <w:p>
+      <w:r>
+        <w:rPr>
+          <w:rFonts w:ascii="Noto Sans" w:hAnsi="Noto Sans" w:eastAsia="Noto Sans" w:cs="Noto Sans"/>
+          <w:sz w:val="20"/>
+          <w:szCs w:val="20"/>
+        </w:rPr>
+        <w:t xml:space="preserve">Noto Sans 9 pt, capitals:</w:t>
+      </w:r>
+      <w:r>
+        <w:br/>
+      </w:r>
+      <w:r>
+        <w:rPr>
+          <w:rFonts w:ascii="Noto Sans" w:hAnsi="Noto Sans" w:eastAsia="Noto Sans" w:cs="Noto Sans"/>
+          <w:sz w:val="18"/>
+          <w:szCs w:val="18"/>
+        </w:rPr>
+        <w:t xml:space="preserve">HAMBURG</w:t>
+      </w:r>
+    </w:p>
+    <w:p>
+      <w:r>
+        <w:rPr>
+          <w:rFonts w:ascii="Noto Sans" w:hAnsi="Noto Sans" w:eastAsia="Noto Sans" w:cs="Noto Sans"/>
+          <w:sz w:val="20"/>
+          <w:szCs w:val="20"/>
+        </w:rPr>
+        <w:t xml:space="preserve">Noto Sans 9 pt, mixed small caps:</w:t>
+      </w:r>
+      <w:r>
+        <w:br/>
+      </w:r>
+      <w:r>
+        <w:rPr>
+          <w:rFonts w:ascii="Noto Sans" w:hAnsi="Noto Sans" w:eastAsia="Noto Sans" w:cs="Noto Sans"/>
+          <w:smallCaps/>
+          <w:sz w:val="18"/>
+          <w:szCs w:val="18"/>
+        </w:rPr>
+        <w:t xml:space="preserve">Hamburg</w:t>
+      </w:r>
+    </w:p>
+    <w:p>
+      <w:r>
+        <w:rPr>
+          <w:rFonts w:ascii="Noto Sans" w:hAnsi="Noto Sans" w:eastAsia="Noto Sans" w:cs="Noto Sans"/>
+          <w:sz w:val="20"/>
+          <w:szCs w:val="20"/>
+        </w:rPr>
+        <w:t xml:space="preserve">Noto Sans 10.5 pt, small caps:</w:t>
+      </w:r>
+      <w:r>
+        <w:br/>
+      </w:r>
+      <w:r>
+        <w:rPr>
+          <w:rFonts w:ascii="Noto Sans" w:hAnsi="Noto Sans" w:eastAsia="Noto Sans" w:cs="Noto Sans"/>
+          <w:smallCaps/>
+          <w:sz w:val="21"/>
+          <w:szCs w:val="21"/>
+        </w:rPr>
+        <w:t xml:space="preserve">hamburg</w:t>
+      </w:r>
+    </w:p>
+    <w:p>
+      <w:r>
+        <w:rPr>
+          <w:rFonts w:ascii="Noto Sans" w:hAnsi="Noto Sans" w:eastAsia="Noto Sans" w:cs="Noto Sans"/>
+          <w:sz w:val="20"/>
+          <w:szCs w:val="20"/>
+        </w:rPr>
+        <w:t xml:space="preserve">Noto Sans 10.5 pt, capitals:</w:t>
+      </w:r>
+      <w:r>
+        <w:br/>
+      </w:r>
+      <w:r>
+        <w:rPr>
+          <w:rFonts w:ascii="Noto Sans" w:hAnsi="Noto Sans" w:eastAsia="Noto Sans" w:cs="Noto Sans"/>
+          <w:sz w:val="21"/>
+          <w:szCs w:val="21"/>
+        </w:rPr>
+        <w:t xml:space="preserve">HAMBURG</w:t>
+      </w:r>
+    </w:p>
+    <w:p>
+      <w:r>
+        <w:rPr>
+          <w:rFonts w:ascii="Noto Sans" w:hAnsi="Noto Sans" w:eastAsia="Noto Sans" w:cs="Noto Sans"/>
+          <w:sz w:val="20"/>
+          <w:szCs w:val="20"/>
+        </w:rPr>
+        <w:t xml:space="preserve">Noto Sans 10.5 pt, mixed small caps:</w:t>
+      </w:r>
+      <w:r>
+        <w:br/>
+      </w:r>
+      <w:r>
+        <w:rPr>
+          <w:rFonts w:ascii="Noto Sans" w:hAnsi="Noto Sans" w:eastAsia="Noto Sans" w:cs="Noto Sans"/>
+          <w:smallCaps/>
+          <w:sz w:val="21"/>
+          <w:szCs w:val="21"/>
+        </w:rPr>
+        <w:t xml:space="preserve">Hamburg</w:t>
+      </w:r>
+    </w:p>
+    <w:p>
+      <w:r>
+        <w:rPr>
+          <w:rFonts w:ascii="Noto Sans" w:hAnsi="Noto Sans" w:eastAsia="Noto Sans" w:cs="Noto Sans"/>
+          <w:sz w:val="20"/>
+          <w:szCs w:val="20"/>
+        </w:rPr>
+        <w:t xml:space="preserve">Noto Sans 11 pt, small caps:</w:t>
+      </w:r>
+      <w:r>
+        <w:br/>
+      </w:r>
+      <w:r>
+        <w:rPr>
+          <w:rFonts w:ascii="Noto Sans" w:hAnsi="Noto Sans" w:eastAsia="Noto Sans" w:cs="Noto Sans"/>
+          <w:smallCaps/>
+          <w:sz w:val="22"/>
+          <w:szCs w:val="22"/>
+        </w:rPr>
+        <w:t xml:space="preserve">hamburg</w:t>
+      </w:r>
+    </w:p>
+    <w:p>
+      <w:r>
+        <w:rPr>
+          <w:rFonts w:ascii="Noto Sans" w:hAnsi="Noto Sans" w:eastAsia="Noto Sans" w:cs="Noto Sans"/>
+          <w:sz w:val="20"/>
+          <w:szCs w:val="20"/>
+        </w:rPr>
+        <w:t xml:space="preserve">Noto Sans 11 pt, capitals:</w:t>
+      </w:r>
+      <w:r>
+        <w:br/>
+      </w:r>
+      <w:r>
+        <w:rPr>
+          <w:rFonts w:ascii="Noto Sans" w:hAnsi="Noto Sans" w:eastAsia="Noto Sans" w:cs="Noto Sans"/>
+          <w:sz w:val="22"/>
+          <w:szCs w:val="22"/>
+        </w:rPr>
+        <w:t xml:space="preserve">HAMBURG</w:t>
+      </w:r>
+    </w:p>
+    <w:p>
+      <w:r>
+        <w:rPr>
+          <w:rFonts w:ascii="Noto Sans" w:hAnsi="Noto Sans" w:eastAsia="Noto Sans" w:cs="Noto Sans"/>
+          <w:sz w:val="20"/>
+          <w:szCs w:val="20"/>
+        </w:rPr>
+        <w:t xml:space="preserve">Noto Sans 11 pt, mixed small caps:</w:t>
+      </w:r>
+      <w:r>
+        <w:br/>
+      </w:r>
+      <w:r>
+        <w:rPr>
+          <w:rFonts w:ascii="Noto Sans" w:hAnsi="Noto Sans" w:eastAsia="Noto Sans" w:cs="Noto Sans"/>
+          <w:smallCaps/>
+          <w:sz w:val="22"/>
+          <w:szCs w:val="22"/>
+        </w:rPr>
+        <w:t xml:space="preserve">Hamburg</w:t>
+      </w:r>
+    </w:p>
+    <w:p>
+      <w:r>
+        <w:rPr>
+          <w:rFonts w:ascii="Noto Sans" w:hAnsi="Noto Sans" w:eastAsia="Noto Sans" w:cs="Noto Sans"/>
+          <w:sz w:val="20"/>
+          <w:szCs w:val="20"/>
+        </w:rPr>
+        <w:t xml:space="preserve">Noto Sans 13 pt, small caps:</w:t>
+      </w:r>
+      <w:r>
+        <w:br/>
+      </w:r>
+      <w:r>
+        <w:rPr>
+          <w:rFonts w:ascii="Noto Sans" w:hAnsi="Noto Sans" w:eastAsia="Noto Sans" w:cs="Noto Sans"/>
+          <w:smallCaps/>
+          <w:sz w:val="26"/>
+          <w:szCs w:val="26"/>
+        </w:rPr>
+        <w:t xml:space="preserve">hamburg</w:t>
+      </w:r>
+    </w:p>
+    <w:p>
+      <w:r>
+        <w:rPr>
+          <w:rFonts w:ascii="Noto Sans" w:hAnsi="Noto Sans" w:eastAsia="Noto Sans" w:cs="Noto Sans"/>
+          <w:sz w:val="20"/>
+          <w:szCs w:val="20"/>
+        </w:rPr>
+        <w:t xml:space="preserve">Noto Sans 13 pt, capitals:</w:t>
+      </w:r>
+      <w:r>
+        <w:br/>
+      </w:r>
+      <w:r>
+        <w:rPr>
+          <w:rFonts w:ascii="Noto Sans" w:hAnsi="Noto Sans" w:eastAsia="Noto Sans" w:cs="Noto Sans"/>
+          <w:sz w:val="26"/>
+          <w:szCs w:val="26"/>
+        </w:rPr>
+        <w:t xml:space="preserve">HAMBURG</w:t>
+      </w:r>
+    </w:p>
+    <w:p>
+      <w:r>
+        <w:rPr>
+          <w:rFonts w:ascii="Noto Sans" w:hAnsi="Noto Sans" w:eastAsia="Noto Sans" w:cs="Noto Sans"/>
+          <w:sz w:val="20"/>
+          <w:szCs w:val="20"/>
+        </w:rPr>
+        <w:t xml:space="preserve">Noto Sans 13 pt, mixed small caps:</w:t>
+      </w:r>
+      <w:r>
+        <w:br/>
+      </w:r>
+      <w:r>
+        <w:rPr>
+          <w:rFonts w:ascii="Noto Sans" w:hAnsi="Noto Sans" w:eastAsia="Noto Sans" w:cs="Noto Sans"/>
+          <w:smallCaps/>
+          <w:sz w:val="26"/>
+          <w:szCs w:val="26"/>
+        </w:rPr>
+        <w:t xml:space="preserve">Hamburg</w:t>
+      </w:r>
+    </w:p>
+    <w:p>
+      <w:r>
+        <w:rPr>
+          <w:rFonts w:ascii="Noto Sans" w:hAnsi="Noto Sans" w:eastAsia="Noto Sans" w:cs="Noto Sans"/>
+          <w:sz w:val="20"/>
+          <w:szCs w:val="20"/>
+        </w:rPr>
+        <w:t xml:space="preserve">Noto Sans 21 pt, small caps:</w:t>
+      </w:r>
+      <w:r>
+        <w:br/>
+      </w:r>
+      <w:r>
+        <w:rPr>
+          <w:rFonts w:ascii="Noto Sans" w:hAnsi="Noto Sans" w:eastAsia="Noto Sans" w:cs="Noto Sans"/>
+          <w:smallCaps/>
+          <w:sz w:val="42"/>
+          <w:szCs w:val="42"/>
+        </w:rPr>
+        <w:t xml:space="preserve">hamburg</w:t>
+      </w:r>
+    </w:p>
+    <w:p>
+      <w:r>
+        <w:rPr>
+          <w:rFonts w:ascii="Noto Sans" w:hAnsi="Noto Sans" w:eastAsia="Noto Sans" w:cs="Noto Sans"/>
+          <w:sz w:val="20"/>
+          <w:szCs w:val="20"/>
+        </w:rPr>
+        <w:t xml:space="preserve">Noto Sans 21 pt, capitals:</w:t>
+      </w:r>
+      <w:r>
+        <w:br/>
+      </w:r>
+      <w:r>
+        <w:rPr>
+          <w:rFonts w:ascii="Noto Sans" w:hAnsi="Noto Sans" w:eastAsia="Noto Sans" w:cs="Noto Sans"/>
+          <w:sz w:val="42"/>
+          <w:szCs w:val="42"/>
+        </w:rPr>
+        <w:t xml:space="preserve">HAMBURG</w:t>
+      </w:r>
+    </w:p>
+    <w:p>
+      <w:r>
+        <w:rPr>
+          <w:rFonts w:ascii="Noto Sans" w:hAnsi="Noto Sans" w:eastAsia="Noto Sans" w:cs="Noto Sans"/>
+          <w:sz w:val="20"/>
+          <w:szCs w:val="20"/>
+        </w:rPr>
+        <w:t xml:space="preserve">Noto Sans 21 pt, mixed small caps:</w:t>
+      </w:r>
+      <w:r>
+        <w:br/>
+      </w:r>
+      <w:r>
+        <w:rPr>
+          <w:rFonts w:ascii="Noto Sans" w:hAnsi="Noto Sans" w:eastAsia="Noto Sans" w:cs="Noto Sans"/>
+          <w:smallCaps/>
+          <w:sz w:val="42"/>
+          <w:szCs w:val="42"/>
+        </w:rPr>
+        <w:t xml:space="preserve">Hamburg</w:t>
+      </w:r>
+    </w:p>
+    <w:p>
+      <w:r>
+        <w:rPr>
+          <w:rFonts w:ascii="Noto Sans" w:hAnsi="Noto Sans" w:eastAsia="Noto Sans" w:cs="Noto Sans"/>
+          <w:sz w:val="20"/>
+          <w:szCs w:val="20"/>
+        </w:rPr>
+        <w:t xml:space="preserve">Noto Sans 40 pt, small caps:</w:t>
+      </w:r>
+      <w:r>
+        <w:br/>
+      </w:r>
+      <w:r>
+        <w:rPr>
+          <w:rFonts w:ascii="Noto Sans" w:hAnsi="Noto Sans" w:eastAsia="Noto Sans" w:cs="Noto Sans"/>
+          <w:smallCaps/>
+          <w:sz w:val="80"/>
+          <w:szCs w:val="80"/>
+        </w:rPr>
+        <w:t xml:space="preserve">hamburg</w:t>
+      </w:r>
+    </w:p>
+    <w:p>
+      <w:r>
+        <w:rPr>
+          <w:rFonts w:ascii="Noto Sans" w:hAnsi="Noto Sans" w:eastAsia="Noto Sans" w:cs="Noto Sans"/>
+          <w:sz w:val="20"/>
+          <w:szCs w:val="20"/>
+        </w:rPr>
+        <w:t xml:space="preserve">Noto Sans 40 pt, capitals:</w:t>
+      </w:r>
+      <w:r>
+        <w:br/>
+      </w:r>
+      <w:r>
+        <w:rPr>
+          <w:rFonts w:ascii="Noto Sans" w:hAnsi="Noto Sans" w:eastAsia="Noto Sans" w:cs="Noto Sans"/>
+          <w:sz w:val="80"/>
+          <w:szCs w:val="80"/>
+        </w:rPr>
+        <w:t xml:space="preserve">HAMBURG</w:t>
+      </w:r>
+    </w:p>
+    <w:p>
+      <w:r>
+        <w:rPr>
+          <w:rFonts w:ascii="Noto Sans" w:hAnsi="Noto Sans" w:eastAsia="Noto Sans" w:cs="Noto Sans"/>
+          <w:sz w:val="20"/>
+          <w:szCs w:val="20"/>
+        </w:rPr>
+        <w:t xml:space="preserve">Noto Sans 40 pt, mixed small caps:</w:t>
+      </w:r>
+      <w:r>
+        <w:br/>
+      </w:r>
+      <w:r>
+        <w:rPr>
+          <w:rFonts w:ascii="Noto Sans" w:hAnsi="Noto Sans" w:eastAsia="Noto Sans" w:cs="Noto Sans"/>
+          <w:smallCaps/>
+          <w:sz w:val="80"/>
+          <w:szCs w:val="80"/>
+        </w:rPr>
+        <w:t xml:space="preserve">Hamburg</w:t>
+      </w:r>
+    </w:p>
+    <w:p>
+      <w:r>
+        <w:rPr>
+          <w:rFonts w:ascii="Noto Sans" w:hAnsi="Noto Sans" w:eastAsia="Noto Sans" w:cs="Noto Sans"/>
+          <w:sz w:val="20"/>
+          <w:szCs w:val="20"/>
+        </w:rPr>
+        <w:t xml:space="preserve">Noto Sans 72 pt, small caps:</w:t>
+      </w:r>
+      <w:r>
+        <w:br/>
+      </w:r>
+      <w:r>
+        <w:rPr>
+          <w:rFonts w:ascii="Noto Sans" w:hAnsi="Noto Sans" w:eastAsia="Noto Sans" w:cs="Noto Sans"/>
+          <w:smallCaps/>
+          <w:sz w:val="144"/>
+          <w:szCs w:val="144"/>
+        </w:rPr>
+        <w:t xml:space="preserve">hamburg</w:t>
+      </w:r>
+    </w:p>
+    <w:p>
+      <w:r>
+        <w:rPr>
+          <w:rFonts w:ascii="Noto Sans" w:hAnsi="Noto Sans" w:eastAsia="Noto Sans" w:cs="Noto Sans"/>
+          <w:sz w:val="20"/>
+          <w:szCs w:val="20"/>
+        </w:rPr>
+        <w:t xml:space="preserve">Noto Sans 72 pt, capitals:</w:t>
+      </w:r>
+      <w:r>
+        <w:br/>
+      </w:r>
+      <w:r>
+        <w:rPr>
+          <w:rFonts w:ascii="Noto Sans" w:hAnsi="Noto Sans" w:eastAsia="Noto Sans" w:cs="Noto Sans"/>
+          <w:sz w:val="144"/>
+          <w:szCs w:val="144"/>
+        </w:rPr>
+        <w:t xml:space="preserve">HAMBURG</w:t>
+      </w:r>
+    </w:p>
+    <w:p>
+      <w:r>
+        <w:rPr>
+          <w:rFonts w:ascii="Noto Sans" w:hAnsi="Noto Sans" w:eastAsia="Noto Sans" w:cs="Noto Sans"/>
+          <w:sz w:val="20"/>
+          <w:szCs w:val="20"/>
+        </w:rPr>
+        <w:t xml:space="preserve">Noto Sans 72 pt, mixed small caps:</w:t>
+      </w:r>
+      <w:r>
+        <w:br/>
+      </w:r>
+      <w:r>
+        <w:rPr>
+          <w:rFonts w:ascii="Noto Sans" w:hAnsi="Noto Sans" w:eastAsia="Noto Sans" w:cs="Noto Sans"/>
           <w:smallCaps/>
           <w:sz w:val="144"/>
           <w:szCs w:val="144"/>

</xml_diff>